<commit_message>
Conserva estado óptico al adoptar inversor
</commit_message>
<xml_diff>
--- a/Anexo_72_Esquema_Practico_Auditoria_BIPV.docx
+++ b/Anexo_72_Esquema_Practico_Auditoria_BIPV.docx
@@ -181,7 +181,7 @@
         <w:t>Prueba de fuego</w:t>
       </w:r>
       <w:r>
-        <w:t>: adoptar una alternativa y confirmar que Producción/Financiero/CO₂ dejan de estar vigentes. Después de adoptar, volver a ejecutar Motor Óptico cuando corresponda, Producción y Financiero antes de seguir. Repetir también la comparación antes de pedir al Analista local una nueva recomendación.</w:t>
+        <w:t>: adoptar una alternativa y confirmar que Producción/Financiero/CO₂ dejan de estar vigentes. Al adoptar inversor, el Motor Óptico vigente debe conservarse; vuelve a ejecutar Producción y Financiero antes de seguir. Repetir también la comparación antes de pedir al Analista local una nueva recomendación.</w:t>
       </w:r>
     </w:p>
     <w:p>
@@ -228,20 +228,6 @@
       </w:r>
       <w:r>
         <w:t>:</w:t>
-      </w:r>
-    </w:p>
-    <w:p>
-      <w:pPr>
-        <w:pStyle w:val="ListBullet"/>
-      </w:pPr>
-      <w:r>
-        <w:rPr>
-          <w:b/>
-        </w:rPr>
-        <w:t>Adopción de inversor:</w:t>
-      </w:r>
-      <w:r>
-        <w:t xml:space="preserve"> por seguridad vuelve a ejecutar Motor Óptico si estaba activo, porque la implementación aún conserva solo una parte de su estado.</w:t>
       </w:r>
     </w:p>
     <w:p>

</xml_diff>